<commit_message>
refactor(terraform): one main.tf per configuration
Each config (gitlab, runner) is now a single main.tf with marked sections:
settings, variables, resource group, network, security, VM, outputs.
Same code, only moved: Terraform reads all .tf files in a folder as one,
so nothing in Azure changes. Docs and Word/PDF updated.
</commit_message>
<xml_diff>
--- a/docs/Gitra-Platform-Documentation.docx
+++ b/docs/Gitra-Platform-Documentation.docx
@@ -361,7 +361,7 @@
           <w:sz w:val="20"/>
           <w:szCs w:val="20"/>
         </w:rPr>
-        <w:t xml:space="preserve">Repository: github.com/Mohammed-Alghumayti/gitra-platform (branch Testing) · 2026-10-06</w:t>
+        <w:t xml:space="preserve">Repository: github.com/Mohammed-Alghumayti/gitra-platform (branch Testing) · 2026-10-07</w:t>
       </w:r>
     </w:p>
     <w:p>
@@ -2940,7 +2940,37 @@
         <w:rPr>
           <w:rFonts w:ascii="Arial" w:cs="Arial" w:eastAsia="Arial" w:hAnsi="Arial"/>
         </w:rPr>
-        <w:t xml:space="preserve"> — so a change to one can never touch the other.</w:t>
+        <w:t xml:space="preserve"> — so a change to one can never touch the other. Each configuration is a single </w:t>
+      </w:r>
+      <w:r>
+        <w:rPr>
+          <w:rFonts w:ascii="Consolas" w:cs="Consolas" w:eastAsia="Consolas" w:hAnsi="Consolas"/>
+          <w:color w:val="B42318"/>
+          <w:sz w:val="19"/>
+          <w:szCs w:val="19"/>
+        </w:rPr>
+        <w:t xml:space="preserve">main.tf</w:t>
+      </w:r>
+      <w:r>
+        <w:rPr>
+          <w:rFonts w:ascii="Arial" w:cs="Arial" w:eastAsia="Arial" w:hAnsi="Arial"/>
+        </w:rPr>
+        <w:t xml:space="preserve">, split into clearly marked sections (settings, variables, resource group, network, security, VM, outputs); Terraform reads all </w:t>
+      </w:r>
+      <w:r>
+        <w:rPr>
+          <w:rFonts w:ascii="Consolas" w:cs="Consolas" w:eastAsia="Consolas" w:hAnsi="Consolas"/>
+          <w:color w:val="B42318"/>
+          <w:sz w:val="19"/>
+          <w:szCs w:val="19"/>
+        </w:rPr>
+        <w:t xml:space="preserve">.tf</w:t>
+      </w:r>
+      <w:r>
+        <w:rPr>
+          <w:rFonts w:ascii="Arial" w:cs="Arial" w:eastAsia="Arial" w:hAnsi="Arial"/>
+        </w:rPr>
+        <w:t xml:space="preserve"> files in a folder as one, so file layout doesn't change what gets built.</w:t>
       </w:r>
     </w:p>
     <w:p>
@@ -2999,7 +3029,7 @@
           <w:sz w:val="14"/>
           <w:szCs w:val="14"/>
         </w:rPr>
-        <w:t xml:space="preserve">│   ├── providers.tf               # azurerm + random, remote state in Azure Storage</w:t>
+        <w:t xml:space="preserve">│   ├── main.tf                    # Everything, in sections:</w:t>
       </w:r>
     </w:p>
     <w:p>
@@ -3015,7 +3045,7 @@
           <w:sz w:val="14"/>
           <w:szCs w:val="14"/>
         </w:rPr>
-        <w:t xml:space="preserve">│   ├── variables.tf               # Region, zone, VM size, DNS label, address ranges…</w:t>
+        <w:t xml:space="preserve">│   │                              #   settings: azurerm + random, remote state in Azure Storage</w:t>
       </w:r>
     </w:p>
     <w:p>
@@ -3031,7 +3061,7 @@
           <w:sz w:val="14"/>
           <w:szCs w:val="14"/>
         </w:rPr>
-        <w:t xml:space="preserve">│   ├── main.tf                    # Resource group gitra-rg</w:t>
+        <w:t xml:space="preserve">│   │                              #   variables: region, zone, VM size, DNS label, address ranges</w:t>
       </w:r>
     </w:p>
     <w:p>
@@ -3047,7 +3077,7 @@
           <w:sz w:val="14"/>
           <w:szCs w:val="14"/>
         </w:rPr>
-        <w:t xml:space="preserve">│   ├── network.tf                 # VNet, subnet, static public IP + DNS name, NIC</w:t>
+        <w:t xml:space="preserve">│   │                              #   resource group gitra-rg</w:t>
       </w:r>
     </w:p>
     <w:p>
@@ -3063,7 +3093,7 @@
           <w:sz w:val="14"/>
           <w:szCs w:val="14"/>
         </w:rPr>
-        <w:t xml:space="preserve">│   ├── security.tf                # NSG (22, 80, 443, 2224) + NIC association</w:t>
+        <w:t xml:space="preserve">│   │                              #   network: VNet, subnet, static public IP + DNS name, NIC</w:t>
       </w:r>
     </w:p>
     <w:p>
@@ -3079,7 +3109,7 @@
           <w:sz w:val="14"/>
           <w:szCs w:val="14"/>
         </w:rPr>
-        <w:t xml:space="preserve">│   ├── vm.tf                      # gitra-gitlab-vm (Standard_D4s_v4, Trusted Launch)</w:t>
+        <w:t xml:space="preserve">│   │                              #   security: NSG (22, 80, 443, 2224) + NIC association</w:t>
       </w:r>
     </w:p>
     <w:p>
@@ -3095,7 +3125,7 @@
           <w:sz w:val="14"/>
           <w:szCs w:val="14"/>
         </w:rPr>
-        <w:t xml:space="preserve">│   ├── outputs.tf                 # GitLab URL, public IP</w:t>
+        <w:t xml:space="preserve">│   │                              #   VM: gitra-gitlab-vm (Standard_D4s_v4, Trusted Launch)</w:t>
       </w:r>
     </w:p>
     <w:p>
@@ -3111,7 +3141,7 @@
           <w:sz w:val="14"/>
           <w:szCs w:val="14"/>
         </w:rPr>
-        <w:t xml:space="preserve">│   ├── import_existing.sh         # Adopts the existing resources into the state</w:t>
+        <w:t xml:space="preserve">│   │                              #   outputs: GitLab URL, public IP</w:t>
       </w:r>
     </w:p>
     <w:p>
@@ -3127,7 +3157,7 @@
           <w:sz w:val="14"/>
           <w:szCs w:val="14"/>
         </w:rPr>
-        <w:t xml:space="preserve">│   └── tests/platform.tftest.hcl  # Names, sizes, ranges, NSG ports</w:t>
+        <w:t xml:space="preserve">│   ├── import_existing.sh         # Adopts the existing resources into the state</w:t>
       </w:r>
     </w:p>
     <w:p>
@@ -3143,7 +3173,7 @@
           <w:sz w:val="14"/>
           <w:szCs w:val="14"/>
         </w:rPr>
-        <w:t xml:space="preserve">└── runner/                        # CI runner (state: gitra-runner.tfstate)</w:t>
+        <w:t xml:space="preserve">│   └── tests/platform.tftest.hcl  # Names, sizes, ranges, NSG ports</w:t>
       </w:r>
     </w:p>
     <w:p>
@@ -3159,7 +3189,7 @@
           <w:sz w:val="14"/>
           <w:szCs w:val="14"/>
         </w:rPr>
-        <w:t xml:space="preserve">    ├── providers.tf, variables.tf, main.tf</w:t>
+        <w:t xml:space="preserve">└── runner/                        # CI runner (state: gitra-runner.tfstate)</w:t>
       </w:r>
     </w:p>
     <w:p>
@@ -3175,7 +3205,7 @@
           <w:sz w:val="14"/>
           <w:szCs w:val="14"/>
         </w:rPr>
-        <w:t xml:space="preserve">    ├── network.tf                 # VNet, subnet, static public IP, NIC</w:t>
+        <w:t xml:space="preserve">    ├── main.tf                    # Everything, in sections:</w:t>
       </w:r>
     </w:p>
     <w:p>
@@ -3191,7 +3221,7 @@
           <w:sz w:val="14"/>
           <w:szCs w:val="14"/>
         </w:rPr>
-        <w:t xml:space="preserve">    ├── security.tf                # NSG (22, 5000) + NIC association</w:t>
+        <w:t xml:space="preserve">    │                              #   settings, variables, resource group gitra-runner-rg</w:t>
       </w:r>
     </w:p>
     <w:p>
@@ -3207,7 +3237,7 @@
           <w:sz w:val="14"/>
           <w:szCs w:val="14"/>
         </w:rPr>
-        <w:t xml:space="preserve">    ├── vm.tf                      # gitra-runner-vm, SSH keys only</w:t>
+        <w:t xml:space="preserve">    │                              #   network: VNet, subnet, static public IP, NIC</w:t>
       </w:r>
     </w:p>
     <w:p>
@@ -3223,7 +3253,7 @@
           <w:sz w:val="14"/>
           <w:szCs w:val="14"/>
         </w:rPr>
-        <w:t xml:space="preserve">    ├── cloud-init-runner.yaml.tftpl  # First boot: Docker, fail2ban, clone repo, start runner</w:t>
+        <w:t xml:space="preserve">    │                              #   security: NSG (22, 5000) + NIC association</w:t>
       </w:r>
     </w:p>
     <w:p>
@@ -3239,7 +3269,39 @@
           <w:sz w:val="14"/>
           <w:szCs w:val="14"/>
         </w:rPr>
-        <w:t xml:space="preserve">    ├── outputs.tf                 # Runner IP, SSH command, staging URL</w:t>
+        <w:t xml:space="preserve">    │                              #   VM: gitra-runner-vm, SSH keys only</w:t>
+      </w:r>
+    </w:p>
+    <w:p>
+      <w:pPr>
+        <w:shd w:fill="F4F6FA" w:color="auto" w:val="clear"/>
+        <w:spacing w:after="0" w:before="0" w:line="240"/>
+        <w:ind w:left="120" w:right="120"/>
+      </w:pPr>
+      <w:r>
+        <w:rPr>
+          <w:rFonts w:ascii="Consolas" w:cs="Consolas" w:eastAsia="Consolas" w:hAnsi="Consolas"/>
+          <w:color w:val="1F2937"/>
+          <w:sz w:val="14"/>
+          <w:szCs w:val="14"/>
+        </w:rPr>
+        <w:t xml:space="preserve">    │                              #   outputs: runner IP, SSH command, staging URL</w:t>
+      </w:r>
+    </w:p>
+    <w:p>
+      <w:pPr>
+        <w:shd w:fill="F4F6FA" w:color="auto" w:val="clear"/>
+        <w:spacing w:after="0" w:before="0" w:line="240"/>
+        <w:ind w:left="120" w:right="120"/>
+      </w:pPr>
+      <w:r>
+        <w:rPr>
+          <w:rFonts w:ascii="Consolas" w:cs="Consolas" w:eastAsia="Consolas" w:hAnsi="Consolas"/>
+          <w:color w:val="1F2937"/>
+          <w:sz w:val="14"/>
+          <w:szCs w:val="14"/>
+        </w:rPr>
+        <w:t xml:space="preserve">    ├── cloud-init-runner.yaml.tftpl  # First boot: Docker, fail2ban, clone repo, start runner</w:t>
       </w:r>
     </w:p>
     <w:p>
@@ -7703,8 +7765,8 @@
       </w:tblPr>
       <w:tblGrid>
         <w:gridCol w:w="1260"/>
-        <w:gridCol w:w="3955"/>
-        <w:gridCol w:w="3811"/>
+        <w:gridCol w:w="3889"/>
+        <w:gridCol w:w="3877"/>
       </w:tblGrid>
       <w:tr>
         <w:trPr>
@@ -7743,7 +7805,7 @@
         </w:tc>
         <w:tc>
           <w:tcPr>
-            <w:tcW w:type="dxa" w:w="3955"/>
+            <w:tcW w:type="dxa" w:w="3889"/>
             <w:tcBorders>
               <w:top w:val="single" w:color="C9CED6" w:sz="4"/>
               <w:left w:val="single" w:color="C9CED6" w:sz="4"/>
@@ -7774,7 +7836,7 @@
         </w:tc>
         <w:tc>
           <w:tcPr>
-            <w:tcW w:type="dxa" w:w="3811"/>
+            <w:tcW w:type="dxa" w:w="3877"/>
             <w:tcBorders>
               <w:top w:val="single" w:color="C9CED6" w:sz="4"/>
               <w:left w:val="single" w:color="C9CED6" w:sz="4"/>
@@ -7834,7 +7896,7 @@
         </w:tc>
         <w:tc>
           <w:tcPr>
-            <w:tcW w:type="dxa" w:w="3955"/>
+            <w:tcW w:type="dxa" w:w="3889"/>
             <w:tcBorders>
               <w:top w:val="single" w:color="C9CED6" w:sz="4"/>
               <w:left w:val="single" w:color="C9CED6" w:sz="4"/>
@@ -7861,7 +7923,7 @@
         </w:tc>
         <w:tc>
           <w:tcPr>
-            <w:tcW w:type="dxa" w:w="3811"/>
+            <w:tcW w:type="dxa" w:w="3877"/>
             <w:tcBorders>
               <w:top w:val="single" w:color="C9CED6" w:sz="4"/>
               <w:left w:val="single" w:color="C9CED6" w:sz="4"/>
@@ -7936,7 +7998,7 @@
         </w:tc>
         <w:tc>
           <w:tcPr>
-            <w:tcW w:type="dxa" w:w="3955"/>
+            <w:tcW w:type="dxa" w:w="3889"/>
             <w:tcBorders>
               <w:top w:val="single" w:color="C9CED6" w:sz="4"/>
               <w:left w:val="single" w:color="C9CED6" w:sz="4"/>
@@ -7964,7 +8026,7 @@
         </w:tc>
         <w:tc>
           <w:tcPr>
-            <w:tcW w:type="dxa" w:w="3811"/>
+            <w:tcW w:type="dxa" w:w="3877"/>
             <w:tcBorders>
               <w:top w:val="single" w:color="C9CED6" w:sz="4"/>
               <w:left w:val="single" w:color="C9CED6" w:sz="4"/>
@@ -8022,7 +8084,7 @@
         </w:tc>
         <w:tc>
           <w:tcPr>
-            <w:tcW w:type="dxa" w:w="3955"/>
+            <w:tcW w:type="dxa" w:w="3889"/>
             <w:tcBorders>
               <w:top w:val="single" w:color="C9CED6" w:sz="4"/>
               <w:left w:val="single" w:color="C9CED6" w:sz="4"/>
@@ -8049,7 +8111,7 @@
         </w:tc>
         <w:tc>
           <w:tcPr>
-            <w:tcW w:type="dxa" w:w="3811"/>
+            <w:tcW w:type="dxa" w:w="3877"/>
             <w:tcBorders>
               <w:top w:val="single" w:color="C9CED6" w:sz="4"/>
               <w:left w:val="single" w:color="C9CED6" w:sz="4"/>
@@ -8107,7 +8169,7 @@
         </w:tc>
         <w:tc>
           <w:tcPr>
-            <w:tcW w:type="dxa" w:w="3955"/>
+            <w:tcW w:type="dxa" w:w="3889"/>
             <w:tcBorders>
               <w:top w:val="single" w:color="C9CED6" w:sz="4"/>
               <w:left w:val="single" w:color="C9CED6" w:sz="4"/>
@@ -8135,7 +8197,7 @@
         </w:tc>
         <w:tc>
           <w:tcPr>
-            <w:tcW w:type="dxa" w:w="3811"/>
+            <w:tcW w:type="dxa" w:w="3877"/>
             <w:tcBorders>
               <w:top w:val="single" w:color="C9CED6" w:sz="4"/>
               <w:left w:val="single" w:color="C9CED6" w:sz="4"/>
@@ -8193,7 +8255,7 @@
         </w:tc>
         <w:tc>
           <w:tcPr>
-            <w:tcW w:type="dxa" w:w="3955"/>
+            <w:tcW w:type="dxa" w:w="3889"/>
             <w:tcBorders>
               <w:top w:val="single" w:color="C9CED6" w:sz="4"/>
               <w:left w:val="single" w:color="C9CED6" w:sz="4"/>
@@ -8220,7 +8282,7 @@
         </w:tc>
         <w:tc>
           <w:tcPr>
-            <w:tcW w:type="dxa" w:w="3811"/>
+            <w:tcW w:type="dxa" w:w="3877"/>
             <w:tcBorders>
               <w:top w:val="single" w:color="C9CED6" w:sz="4"/>
               <w:left w:val="single" w:color="C9CED6" w:sz="4"/>
@@ -8277,7 +8339,7 @@
         </w:tc>
         <w:tc>
           <w:tcPr>
-            <w:tcW w:type="dxa" w:w="3955"/>
+            <w:tcW w:type="dxa" w:w="3889"/>
             <w:tcBorders>
               <w:top w:val="single" w:color="C9CED6" w:sz="4"/>
               <w:left w:val="single" w:color="C9CED6" w:sz="4"/>
@@ -8305,7 +8367,7 @@
         </w:tc>
         <w:tc>
           <w:tcPr>
-            <w:tcW w:type="dxa" w:w="3811"/>
+            <w:tcW w:type="dxa" w:w="3877"/>
             <w:tcBorders>
               <w:top w:val="single" w:color="C9CED6" w:sz="4"/>
               <w:left w:val="single" w:color="C9CED6" w:sz="4"/>
@@ -8362,7 +8424,7 @@
                 <w:sz w:val="16"/>
                 <w:szCs w:val="16"/>
               </w:rPr>
-              <w:t xml:space="preserve">terraform/runner/vm.tf</w:t>
+              <w:t xml:space="preserve">terraform/runner/main.tf</w:t>
             </w:r>
           </w:p>
         </w:tc>
@@ -8397,7 +8459,7 @@
         </w:tc>
         <w:tc>
           <w:tcPr>
-            <w:tcW w:type="dxa" w:w="3955"/>
+            <w:tcW w:type="dxa" w:w="3889"/>
             <w:tcBorders>
               <w:top w:val="single" w:color="C9CED6" w:sz="4"/>
               <w:left w:val="single" w:color="C9CED6" w:sz="4"/>
@@ -8441,7 +8503,7 @@
         </w:tc>
         <w:tc>
           <w:tcPr>
-            <w:tcW w:type="dxa" w:w="3811"/>
+            <w:tcW w:type="dxa" w:w="3877"/>
             <w:tcBorders>
               <w:top w:val="single" w:color="C9CED6" w:sz="4"/>
               <w:left w:val="single" w:color="C9CED6" w:sz="4"/>
@@ -8516,7 +8578,7 @@
         </w:tc>
         <w:tc>
           <w:tcPr>
-            <w:tcW w:type="dxa" w:w="3955"/>
+            <w:tcW w:type="dxa" w:w="3889"/>
             <w:tcBorders>
               <w:top w:val="single" w:color="C9CED6" w:sz="4"/>
               <w:left w:val="single" w:color="C9CED6" w:sz="4"/>
@@ -8544,7 +8606,7 @@
         </w:tc>
         <w:tc>
           <w:tcPr>
-            <w:tcW w:type="dxa" w:w="3811"/>
+            <w:tcW w:type="dxa" w:w="3877"/>
             <w:tcBorders>
               <w:top w:val="single" w:color="C9CED6" w:sz="4"/>
               <w:left w:val="single" w:color="C9CED6" w:sz="4"/>
@@ -8601,7 +8663,7 @@
         </w:tc>
         <w:tc>
           <w:tcPr>
-            <w:tcW w:type="dxa" w:w="3955"/>
+            <w:tcW w:type="dxa" w:w="3889"/>
             <w:tcBorders>
               <w:top w:val="single" w:color="C9CED6" w:sz="4"/>
               <w:left w:val="single" w:color="C9CED6" w:sz="4"/>
@@ -8628,7 +8690,7 @@
         </w:tc>
         <w:tc>
           <w:tcPr>
-            <w:tcW w:type="dxa" w:w="3811"/>
+            <w:tcW w:type="dxa" w:w="3877"/>
             <w:tcBorders>
               <w:top w:val="single" w:color="C9CED6" w:sz="4"/>
               <w:left w:val="single" w:color="C9CED6" w:sz="4"/>
@@ -8685,7 +8747,7 @@
         </w:tc>
         <w:tc>
           <w:tcPr>
-            <w:tcW w:type="dxa" w:w="3955"/>
+            <w:tcW w:type="dxa" w:w="3889"/>
             <w:tcBorders>
               <w:top w:val="single" w:color="C9CED6" w:sz="4"/>
               <w:left w:val="single" w:color="C9CED6" w:sz="4"/>
@@ -8730,7 +8792,7 @@
         </w:tc>
         <w:tc>
           <w:tcPr>
-            <w:tcW w:type="dxa" w:w="3811"/>
+            <w:tcW w:type="dxa" w:w="3877"/>
             <w:tcBorders>
               <w:top w:val="single" w:color="C9CED6" w:sz="4"/>
               <w:left w:val="single" w:color="C9CED6" w:sz="4"/>
@@ -8788,7 +8850,7 @@
         </w:tc>
         <w:tc>
           <w:tcPr>
-            <w:tcW w:type="dxa" w:w="3955"/>
+            <w:tcW w:type="dxa" w:w="3889"/>
             <w:tcBorders>
               <w:top w:val="single" w:color="C9CED6" w:sz="4"/>
               <w:left w:val="single" w:color="C9CED6" w:sz="4"/>
@@ -8884,7 +8946,7 @@
         </w:tc>
         <w:tc>
           <w:tcPr>
-            <w:tcW w:type="dxa" w:w="3811"/>
+            <w:tcW w:type="dxa" w:w="3877"/>
             <w:tcBorders>
               <w:top w:val="single" w:color="C9CED6" w:sz="4"/>
               <w:left w:val="single" w:color="C9CED6" w:sz="4"/>
@@ -8942,7 +9004,7 @@
         </w:tc>
         <w:tc>
           <w:tcPr>
-            <w:tcW w:type="dxa" w:w="3955"/>
+            <w:tcW w:type="dxa" w:w="3889"/>
             <w:tcBorders>
               <w:top w:val="single" w:color="C9CED6" w:sz="4"/>
               <w:left w:val="single" w:color="C9CED6" w:sz="4"/>
@@ -8970,7 +9032,7 @@
         </w:tc>
         <w:tc>
           <w:tcPr>
-            <w:tcW w:type="dxa" w:w="3811"/>
+            <w:tcW w:type="dxa" w:w="3877"/>
             <w:tcBorders>
               <w:top w:val="single" w:color="C9CED6" w:sz="4"/>
               <w:left w:val="single" w:color="C9CED6" w:sz="4"/>
@@ -9045,7 +9107,7 @@
         </w:tc>
         <w:tc>
           <w:tcPr>
-            <w:tcW w:type="dxa" w:w="3955"/>
+            <w:tcW w:type="dxa" w:w="3889"/>
             <w:tcBorders>
               <w:top w:val="single" w:color="C9CED6" w:sz="4"/>
               <w:left w:val="single" w:color="C9CED6" w:sz="4"/>
@@ -9072,7 +9134,7 @@
         </w:tc>
         <w:tc>
           <w:tcPr>
-            <w:tcW w:type="dxa" w:w="3811"/>
+            <w:tcW w:type="dxa" w:w="3877"/>
             <w:tcBorders>
               <w:top w:val="single" w:color="C9CED6" w:sz="4"/>
               <w:left w:val="single" w:color="C9CED6" w:sz="4"/>
@@ -9129,7 +9191,7 @@
         </w:tc>
         <w:tc>
           <w:tcPr>
-            <w:tcW w:type="dxa" w:w="3955"/>
+            <w:tcW w:type="dxa" w:w="3889"/>
             <w:tcBorders>
               <w:top w:val="single" w:color="C9CED6" w:sz="4"/>
               <w:left w:val="single" w:color="C9CED6" w:sz="4"/>
@@ -9157,7 +9219,7 @@
         </w:tc>
         <w:tc>
           <w:tcPr>
-            <w:tcW w:type="dxa" w:w="3811"/>
+            <w:tcW w:type="dxa" w:w="3877"/>
             <w:tcBorders>
               <w:top w:val="single" w:color="C9CED6" w:sz="4"/>
               <w:left w:val="single" w:color="C9CED6" w:sz="4"/>
@@ -9240,7 +9302,7 @@
         </w:rPr>
         <w:t xml:space="preserve"> </w:t>
       </w:r>
-      <w:hyperlink w:history="1" r:id="rIdfzklsseanflhowlotpb-a">
+      <w:hyperlink w:history="1" r:id="rIdxhfgsts4h8s1gyetgngxm">
         <w:r>
           <w:rPr>
             <w:rStyle w:val="Hyperlink"/>
@@ -9282,7 +9344,7 @@
         </w:rPr>
         <w:t xml:space="preserve">Open </w:t>
       </w:r>
-      <w:hyperlink w:history="1" r:id="rIduc9gwonvr3f5oiyetfgqq">
+      <w:hyperlink w:history="1" r:id="rIdk6piqyi83jwc-iuhsjcgq">
         <w:r>
           <w:rPr>
             <w:rStyle w:val="Hyperlink"/>
@@ -13919,7 +13981,7 @@
         </w:rPr>
         <w:t xml:space="preserve">Add your own key (once, in </w:t>
       </w:r>
-      <w:hyperlink w:history="1" r:id="rIdvbk48asg8xehvrchhnywd">
+      <w:hyperlink w:history="1" r:id="rIdwz3j1gk3lhipdkifarolc">
         <w:r>
           <w:rPr>
             <w:rStyle w:val="Hyperlink"/>

</xml_diff>